<commit_message>
Guia brinde Como convencer um petista, anúncios de aluguel, câmbio sem empresa e visto Mercosul
Co-Authored-By: Claude Opus 5.5 <noreply@anthropic.com>
Claude-Session: https://claude.ai/code/session_01GJhkYfDrHd3AkmDKDTo71F
</commit_message>
<xml_diff>
--- a/curso/dist/Kit-de-Vendas.docx
+++ b/curso/dist/Kit-de-Vendas.docx
@@ -110,23 +110,23 @@
         <w:pStyle w:val="BodyText"/>
       </w:pPr>
       <w:r>
-        <w:t xml:space="preserve">Bônus avulso (order bump ou isca):</w:t>
-      </w:r>
-      <w:r>
-        <w:t xml:space="preserve"> </w:t>
-      </w:r>
-      <w:r>
-        <w:rPr>
-          <w:bCs/>
-          <w:b/>
-        </w:rPr>
-        <w:t xml:space="preserve">Dossiê: mais 4 anos em manchetes</w:t>
-      </w:r>
-      <w:r>
-        <w:t xml:space="preserve"> </w:t>
-      </w:r>
-      <w:r>
-        <w:t xml:space="preserve">(13 páginas).</w:t>
+        <w:t xml:space="preserve">Brinde para quem compra:</w:t>
+      </w:r>
+      <w:r>
+        <w:t xml:space="preserve"> </w:t>
+      </w:r>
+      <w:r>
+        <w:rPr>
+          <w:bCs/>
+          <w:b/>
+        </w:rPr>
+        <w:t xml:space="preserve">Como convencer um petista</w:t>
+      </w:r>
+      <w:r>
+        <w:t xml:space="preserve"> </w:t>
+      </w:r>
+      <w:r>
+        <w:t xml:space="preserve">(49 páginas: método de conversa, 12 objeções com resposta e dado, roteiros de WhatsApp e o dossiê de 19 manchetes com QR code). Também pode virar isca grátis para captar contatos.</w:t>
       </w:r>
     </w:p>
     <w:bookmarkStart w:id="20" w:name="regras-que-valem-para-todas-as-peças"/>
@@ -2029,7 +2029,25 @@
         <w:pStyle w:val="Compact"/>
       </w:pPr>
       <w:r>
-        <w:t xml:space="preserve">Preço e formato do Dossiê avulso (order bump ou isca grátis).</w:t>
+        <w:t xml:space="preserve">Definir se o guia</w:t>
+      </w:r>
+      <w:r>
+        <w:t xml:space="preserve"> </w:t>
+      </w:r>
+      <w:r>
+        <w:t xml:space="preserve">“</w:t>
+      </w:r>
+      <w:r>
+        <w:t xml:space="preserve">Como convencer um petista</w:t>
+      </w:r>
+      <w:r>
+        <w:t xml:space="preserve">”</w:t>
+      </w:r>
+      <w:r>
+        <w:t xml:space="preserve"> </w:t>
+      </w:r>
+      <w:r>
+        <w:t xml:space="preserve">fica só como brinde ou também como isca grátis.</w:t>
       </w:r>
     </w:p>
     <w:bookmarkEnd w:id="39"/>

</xml_diff>